<commit_message>
Actualización Tiempo - Global
</commit_message>
<xml_diff>
--- a/doc_prueba.docx
+++ b/doc_prueba.docx
@@ -3,23 +3,90 @@
 <w:document xmlns:wpc="http://schemas.microsoft.com/office/word/2010/wordprocessingCanvas" xmlns:cx="http://schemas.microsoft.com/office/drawing/2014/chartex" xmlns:cx1="http://schemas.microsoft.com/office/drawing/2015/9/8/chartex" xmlns:cx2="http://schemas.microsoft.com/office/drawing/2015/10/21/chartex" xmlns:cx3="http://schemas.microsoft.com/office/drawing/2016/5/9/chartex" xmlns:cx4="http://schemas.microsoft.com/office/drawing/2016/5/10/chartex" xmlns:cx5="http://schemas.microsoft.com/office/drawing/2016/5/11/chartex" xmlns:cx6="http://schemas.microsoft.com/office/drawing/2016/5/12/chartex" xmlns:cx7="http://schemas.microsoft.com/office/drawing/2016/5/13/chartex" xmlns:cx8="http://schemas.microsoft.com/office/drawing/2016/5/14/chartex" xmlns:mc="http://schemas.openxmlformats.org/markup-compatibility/2006" xmlns:aink="http://schemas.microsoft.com/office/drawing/2016/ink" xmlns:am3d="http://schemas.microsoft.com/office/drawing/2017/model3d" xmlns:o="urn:schemas-microsoft-com:office:office" xmlns:oel="http://schemas.microsoft.com/office/2019/extlst" xmlns:r="http://schemas.openxmlformats.org/officeDocument/2006/relationships" xmlns:m="http://schemas.openxmlformats.org/officeDocument/2006/math" xmlns:v="urn:schemas-microsoft-com:vml" xmlns:wp14="http://schemas.microsoft.com/office/word/2010/wordprocessingDrawing" xmlns:wp="http://schemas.openxmlformats.org/drawingml/2006/wordprocessingDrawing" xmlns:w10="urn:schemas-microsoft-com:office:word" xmlns:w="http://schemas.openxmlformats.org/wordprocessingml/2006/main" xmlns:w14="http://schemas.microsoft.com/office/word/2010/wordml" xmlns:w15="http://schemas.microsoft.com/office/word/2012/wordml" xmlns:w16cex="http://schemas.microsoft.com/office/word/2018/wordml/cex" xmlns:w16cid="http://schemas.microsoft.com/office/word/2016/wordml/cid" xmlns:w16="http://schemas.microsoft.com/office/word/2018/wordml" xmlns:w16sdtdh="http://schemas.microsoft.com/office/word/2020/wordml/sdtdatahash" xmlns:w16se="http://schemas.microsoft.com/office/word/2015/wordml/symex" xmlns:wpg="http://schemas.microsoft.com/office/word/2010/wordprocessingGroup" xmlns:wpi="http://schemas.microsoft.com/office/word/2010/wordprocessingInk" xmlns:wne="http://schemas.microsoft.com/office/word/2006/wordml" xmlns:wps="http://schemas.microsoft.com/office/word/2010/wordprocessingShape" mc:Ignorable="w14 w15 w16se w16cid w16 w16cex w16sdtdh wp14">
   <w:body>
     <w:p>
-      <w:r>
-        <w:t xml:space="preserve">El agua es fundamental para la vida en la Tierra. </w:t>
-      </w:r>
-    </w:p>
-    <w:p>
-      <w:r>
-        <w:t xml:space="preserve">Los seres vivos dependen de ella para sobrevivir y las plantas necesitan agua para realizar la fotosíntesis. </w:t>
-      </w:r>
-    </w:p>
-    <w:p>
-      <w:r>
-        <w:t xml:space="preserve">Por otro lado, el reciclaje ayuda a cuidar el medio ambiente. </w:t>
-      </w:r>
-    </w:p>
-    <w:p>
-      <w:r>
-        <w:t>Transformar los residuos en nuevos productos reduce la contaminación y favorece un planeta más limpio.</w:t>
+      <w:pPr>
+        <w:rPr>
+          <w:u w:val="single"/>
+        </w:rPr>
+      </w:pPr>
+      <w:r>
+        <w:t xml:space="preserve">El verdadero nombre de </w:t>
+      </w:r>
+      <w:r>
+        <w:rPr>
+          <w:b/>
+          <w:bCs/>
+        </w:rPr>
+        <w:t xml:space="preserve">Rita </w:t>
+      </w:r>
+      <w:proofErr w:type="spellStart"/>
+      <w:r>
+        <w:rPr>
+          <w:b/>
+          <w:bCs/>
+        </w:rPr>
+        <w:t>Hayworth</w:t>
+      </w:r>
+      <w:proofErr w:type="spellEnd"/>
+      <w:r>
+        <w:t xml:space="preserve"> era </w:t>
+      </w:r>
+      <w:r>
+        <w:rPr>
+          <w:b/>
+          <w:bCs/>
+        </w:rPr>
+        <w:t>Margarita Carmen Cansino</w:t>
+      </w:r>
+      <w:r>
+        <w:t xml:space="preserve">, nacida en Nueva York el 17 de octubre de 1918 y fallecida en Manhattan el 14 de mayo de 1987. Se destacó como actriz, bailarina y figura pin-up estadounidense. En la década de 1940 alcanzó fama internacional, convirtiéndose en una de las estrellas más reconocidas de la </w:t>
+      </w:r>
+      <w:r>
+        <w:rPr>
+          <w:b/>
+          <w:bCs/>
+        </w:rPr>
+        <w:t>Edad de Oro de Hollywood</w:t>
+      </w:r>
+      <w:r>
+        <w:t xml:space="preserve">, con una filmografía de 61 títulos en 38 años. La prensa la apodó </w:t>
+      </w:r>
+      <w:r>
+        <w:rPr>
+          <w:i/>
+          <w:iCs/>
+        </w:rPr>
+        <w:t>“La diosa del amor”</w:t>
+      </w:r>
+      <w:r>
+        <w:t xml:space="preserve"> por su magnetismo y glamour, transformándola en el mayor símbolo de seducción del cine de su tiempo. Durante la </w:t>
+      </w:r>
+      <w:r>
+        <w:rPr>
+          <w:b/>
+          <w:bCs/>
+        </w:rPr>
+        <w:t>Segunda Guerra Mundial</w:t>
+      </w:r>
+      <w:r>
+        <w:t xml:space="preserve"> fue la pin-up predilecta de los soldados, y más tarde el American Film </w:t>
+      </w:r>
+      <w:proofErr w:type="spellStart"/>
+      <w:r>
+        <w:t>Institute</w:t>
+      </w:r>
+      <w:proofErr w:type="spellEnd"/>
+      <w:r>
+        <w:t xml:space="preserve"> la incluyó en el puesto 19 de las estrellas más grandes del séptimo arte. Su rol en </w:t>
+      </w:r>
+      <w:r>
+        <w:rPr>
+          <w:i/>
+          <w:iCs/>
+        </w:rPr>
+        <w:t>Gilda</w:t>
+      </w:r>
+      <w:r>
+        <w:t xml:space="preserve"> la consagró como arquetipo de belleza femenina, con influencia cultural perdurable.</w:t>
       </w:r>
     </w:p>
     <w:sectPr>
@@ -635,7 +702,6 @@
   <w:style w:type="character" w:default="1" w:styleId="Fuentedeprrafopredeter">
     <w:name w:val="Default Paragraph Font"/>
     <w:uiPriority w:val="1"/>
-    <w:semiHidden/>
     <w:unhideWhenUsed/>
   </w:style>
   <w:style w:type="table" w:default="1" w:styleId="Tablanormal">

</xml_diff>